<commit_message>
Actualiza Sistema Grupo CS a v2026.06.03-v6
</commit_message>
<xml_diff>
--- a/web/app/document_templates/anexos/anexo_extension_contrato.docx
+++ b/web/app/document_templates/anexos/anexo_extension_contrato.docx
@@ -20,392 +20,418 @@
     </w:p>
     <w:p>
       <w:pPr>
-        <w:jc w:val="right"/>
-        <w:rPr>
-          <w:rFonts w:asciiTheme="minorHAnsi" w:hAnsiTheme="minorHAnsi" w:cstheme="minorHAnsi"/>
-        </w:rPr>
-      </w:pPr>
+        <w:jc w:val="both"/>
+        <w:rPr>
+          <w:rFonts w:asciiTheme="minorHAnsi" w:hAnsiTheme="minorHAnsi" w:cstheme="minorHAnsi"/>
+        </w:rPr>
+      </w:pPr>
+      <w:r>
+        <w:rPr>
+          <w:rFonts w:asciiTheme="minorHAnsi" w:hAnsiTheme="minorHAnsi" w:cstheme="minorHAnsi"/>
+        </w:rPr>
+        <w:t>Entre</w:t>
+      </w:r>
+      <w:r>
+        <w:rPr>
+          <w:rFonts w:asciiTheme="minorHAnsi" w:hAnsiTheme="minorHAnsi" w:cstheme="minorHAnsi"/>
+        </w:rPr>
+        <w:t xml:space="preserve"> </w:t>
+      </w:r>
+      <w:r>
+        <w:rPr>
+          <w:rFonts w:asciiTheme="minorHAnsi" w:hAnsiTheme="minorHAnsi" w:cstheme="minorHAnsi"/>
+          <w:b/>
+          <w:noProof/>
+        </w:rPr>
+        <w:t>{{EMPLEADOR_RAZON_SOCIAL}}</w:t>
+      </w:r>
+      <w:r>
+        <w:rPr>
+          <w:rFonts w:asciiTheme="minorHAnsi" w:hAnsiTheme="minorHAnsi" w:cstheme="minorHAnsi"/>
+          <w:b/>
+        </w:rPr>
+        <w:t>,</w:t>
+      </w:r>
+      <w:r>
+        <w:rPr>
+          <w:rFonts w:asciiTheme="minorHAnsi" w:hAnsiTheme="minorHAnsi" w:cstheme="minorHAnsi"/>
+        </w:rPr>
+        <w:t xml:space="preserve"> </w:t>
+      </w:r>
+      <w:r>
+        <w:rPr>
+          <w:rFonts w:asciiTheme="minorHAnsi" w:hAnsiTheme="minorHAnsi" w:cstheme="minorHAnsi"/>
+          <w:b/>
+        </w:rPr>
+        <w:t xml:space="preserve">RUT: </w:t>
+      </w:r>
+      <w:r>
+        <w:rPr>
+          <w:rFonts w:asciiTheme="minorHAnsi" w:hAnsiTheme="minorHAnsi" w:cstheme="minorHAnsi"/>
+          <w:b/>
+          <w:noProof/>
+        </w:rPr>
+        <w:t>{{</w:t>
+      </w:r>
+      <w:r>
+        <w:rPr>
+          <w:rFonts w:asciiTheme="minorHAnsi" w:hAnsiTheme="minorHAnsi" w:cstheme="minorHAnsi"/>
+          <w:b/>
+          <w:noProof/>
+        </w:rPr>
+        <w:t>EMPLEADOR_RUT</w:t>
+      </w:r>
+      <w:r>
+        <w:rPr>
+          <w:rFonts w:asciiTheme="minorHAnsi" w:hAnsiTheme="minorHAnsi" w:cstheme="minorHAnsi"/>
+          <w:b/>
+          <w:noProof/>
+        </w:rPr>
+        <w:t>}}</w:t>
+      </w:r>
+      <w:r>
+        <w:rPr>
+          <w:rFonts w:asciiTheme="minorHAnsi" w:hAnsiTheme="minorHAnsi" w:cstheme="minorHAnsi"/>
+          <w:b/>
+        </w:rPr>
+        <w:t>,</w:t>
+      </w:r>
+      <w:r>
+        <w:rPr>
+          <w:rFonts w:asciiTheme="minorHAnsi" w:hAnsiTheme="minorHAnsi" w:cstheme="minorHAnsi"/>
+        </w:rPr>
+        <w:t xml:space="preserve"> representada legalmente por don </w:t>
+      </w:r>
+      <w:r>
+        <w:rPr>
+          <w:rFonts w:asciiTheme="minorHAnsi" w:hAnsiTheme="minorHAnsi" w:cstheme="minorHAnsi"/>
+          <w:noProof/>
+        </w:rPr>
+        <w:t>{{</w:t>
+      </w:r>
+      <w:r>
+        <w:rPr>
+          <w:rFonts w:asciiTheme="minorHAnsi" w:hAnsiTheme="minorHAnsi" w:cstheme="minorHAnsi"/>
+          <w:noProof/>
+        </w:rPr>
+        <w:t>REP_LEGAL_NOMBRE</w:t>
+      </w:r>
+      <w:r>
+        <w:rPr>
+          <w:rFonts w:asciiTheme="minorHAnsi" w:hAnsiTheme="minorHAnsi" w:cstheme="minorHAnsi"/>
+          <w:noProof/>
+        </w:rPr>
+        <w:t>}}</w:t>
+      </w:r>
+      <w:r>
+        <w:rPr>
+          <w:rFonts w:asciiTheme="minorHAnsi" w:hAnsiTheme="minorHAnsi" w:cstheme="minorHAnsi"/>
+        </w:rPr>
+        <w:t xml:space="preserve">, RUT: </w:t>
+      </w:r>
+      <w:r>
+        <w:rPr>
+          <w:rFonts w:asciiTheme="minorHAnsi" w:hAnsiTheme="minorHAnsi" w:cstheme="minorHAnsi"/>
+          <w:noProof/>
+        </w:rPr>
+        <w:t>{{</w:t>
+      </w:r>
+      <w:r>
+        <w:rPr>
+          <w:rFonts w:asciiTheme="minorHAnsi" w:hAnsiTheme="minorHAnsi" w:cstheme="minorHAnsi"/>
+          <w:noProof/>
+        </w:rPr>
+        <w:t>REP_LEGAL_RUT</w:t>
+      </w:r>
+      <w:r>
+        <w:rPr>
+          <w:rFonts w:asciiTheme="minorHAnsi" w:hAnsiTheme="minorHAnsi" w:cstheme="minorHAnsi"/>
+          <w:noProof/>
+        </w:rPr>
+        <w:t>}}</w:t>
+      </w:r>
+      <w:r>
+        <w:rPr>
+          <w:rFonts w:asciiTheme="minorHAnsi" w:hAnsiTheme="minorHAnsi" w:cstheme="minorHAnsi"/>
+        </w:rPr>
+        <w:t xml:space="preserve">, ambos con domicilio en </w:t>
+      </w:r>
+      <w:r>
+        <w:rPr>
+          <w:rFonts w:asciiTheme="minorHAnsi" w:hAnsiTheme="minorHAnsi" w:cstheme="minorHAnsi"/>
+          <w:noProof/>
+        </w:rPr>
+        <w:t>{{</w:t>
+      </w:r>
+      <w:r>
+        <w:rPr>
+          <w:rFonts w:asciiTheme="minorHAnsi" w:hAnsiTheme="minorHAnsi" w:cstheme="minorHAnsi"/>
+          <w:noProof/>
+        </w:rPr>
+        <w:t>EMPLEADOR_DIRECCION</w:t>
+      </w:r>
+      <w:r>
+        <w:rPr>
+          <w:rFonts w:asciiTheme="minorHAnsi" w:hAnsiTheme="minorHAnsi" w:cstheme="minorHAnsi"/>
+          <w:noProof/>
+        </w:rPr>
+        <w:t>}}</w:t>
+      </w:r>
+      <w:r>
+        <w:rPr>
+          <w:rFonts w:asciiTheme="minorHAnsi" w:hAnsiTheme="minorHAnsi" w:cstheme="minorHAnsi"/>
+        </w:rPr>
+        <w:t xml:space="preserve">, comuna de </w:t>
+      </w:r>
+      <w:r>
+        <w:rPr>
+          <w:rFonts w:asciiTheme="minorHAnsi" w:hAnsiTheme="minorHAnsi" w:cstheme="minorHAnsi"/>
+          <w:noProof/>
+        </w:rPr>
+        <w:t>{{</w:t>
+      </w:r>
+      <w:r>
+        <w:t>E</w:t>
+      </w:r>
+      <w:r>
+        <w:rPr>
+          <w:rFonts w:asciiTheme="minorHAnsi" w:hAnsiTheme="minorHAnsi" w:cstheme="minorHAnsi"/>
+          <w:noProof/>
+        </w:rPr>
+        <w:t>MPLEADOR_COMUNA</w:t>
+      </w:r>
+      <w:r>
+        <w:rPr>
+          <w:rFonts w:asciiTheme="minorHAnsi" w:hAnsiTheme="minorHAnsi" w:cstheme="minorHAnsi"/>
+          <w:noProof/>
+        </w:rPr>
+        <w:t>}}</w:t>
+      </w:r>
+      <w:r>
+        <w:rPr>
+          <w:rFonts w:asciiTheme="minorHAnsi" w:hAnsiTheme="minorHAnsi" w:cstheme="minorHAnsi"/>
+        </w:rPr>
+        <w:t xml:space="preserve">, en lo sucesivo </w:t>
+      </w:r>
+      <w:r>
+        <w:rPr>
+          <w:rFonts w:asciiTheme="minorHAnsi" w:hAnsiTheme="minorHAnsi" w:cstheme="minorHAnsi"/>
+          <w:b/>
+        </w:rPr>
+        <w:t>El Empleador,</w:t>
+      </w:r>
+      <w:r>
+        <w:rPr>
+          <w:rFonts w:asciiTheme="minorHAnsi" w:hAnsiTheme="minorHAnsi" w:cstheme="minorHAnsi"/>
+          <w:bCs/>
+        </w:rPr>
+        <w:t xml:space="preserve"> por una parte; y por la otra,</w:t>
+      </w:r>
+      <w:r>
+        <w:rPr>
+          <w:rFonts w:asciiTheme="minorHAnsi" w:hAnsiTheme="minorHAnsi" w:cstheme="minorHAnsi"/>
+        </w:rPr>
+        <w:t xml:space="preserve"> </w:t>
+      </w:r>
+      <w:r>
+        <w:rPr>
+          <w:rFonts w:asciiTheme="minorHAnsi" w:hAnsiTheme="minorHAnsi" w:cstheme="minorHAnsi"/>
+          <w:noProof/>
+        </w:rPr>
+        <w:t>don</w:t>
+      </w:r>
+      <w:r>
+        <w:rPr>
+          <w:rFonts w:asciiTheme="minorHAnsi" w:hAnsiTheme="minorHAnsi" w:cstheme="minorHAnsi"/>
+          <w:noProof/>
+        </w:rPr>
+        <w:t>/ña</w:t>
+      </w:r>
+      <w:r>
+        <w:rPr>
+          <w:rFonts w:asciiTheme="minorHAnsi" w:hAnsiTheme="minorHAnsi" w:cstheme="minorHAnsi"/>
+        </w:rPr>
+        <w:t xml:space="preserve"> </w:t>
+      </w:r>
+      <w:r>
+        <w:rPr>
+          <w:rFonts w:asciiTheme="minorHAnsi" w:hAnsiTheme="minorHAnsi" w:cstheme="minorHAnsi"/>
+          <w:b/>
+          <w:noProof/>
+        </w:rPr>
+        <w:t>{{</w:t>
+      </w:r>
+      <w:r>
+        <w:rPr>
+          <w:rFonts w:asciiTheme="minorHAnsi" w:hAnsiTheme="minorHAnsi" w:cstheme="minorHAnsi"/>
+          <w:b/>
+          <w:noProof/>
+        </w:rPr>
+        <w:t>TRABAJADOR_</w:t>
+      </w:r>
+      <w:r>
+        <w:rPr>
+          <w:rFonts w:asciiTheme="minorHAnsi" w:hAnsiTheme="minorHAnsi" w:cstheme="minorHAnsi"/>
+          <w:b/>
+          <w:noProof/>
+        </w:rPr>
+        <w:t>NOMBRES</w:t>
+      </w:r>
+      <w:r>
+        <w:rPr>
+          <w:rFonts w:asciiTheme="minorHAnsi" w:hAnsiTheme="minorHAnsi" w:cstheme="minorHAnsi"/>
+          <w:b/>
+          <w:noProof/>
+        </w:rPr>
+        <w:t>}} {{</w:t>
+      </w:r>
+      <w:r>
+        <w:rPr>
+          <w:rFonts w:asciiTheme="minorHAnsi" w:hAnsiTheme="minorHAnsi" w:cstheme="minorHAnsi"/>
+          <w:b/>
+          <w:noProof/>
+        </w:rPr>
+        <w:t>TRABAJADOR_</w:t>
+      </w:r>
+      <w:r>
+        <w:rPr>
+          <w:rFonts w:asciiTheme="minorHAnsi" w:hAnsiTheme="minorHAnsi" w:cstheme="minorHAnsi"/>
+          <w:b/>
+          <w:noProof/>
+        </w:rPr>
+        <w:t>AP_PATERNO</w:t>
+      </w:r>
+      <w:r>
+        <w:rPr>
+          <w:rFonts w:asciiTheme="minorHAnsi" w:hAnsiTheme="minorHAnsi" w:cstheme="minorHAnsi"/>
+          <w:b/>
+          <w:noProof/>
+        </w:rPr>
+        <w:t>}} {{</w:t>
+      </w:r>
+      <w:r>
+        <w:rPr>
+          <w:rFonts w:asciiTheme="minorHAnsi" w:hAnsiTheme="minorHAnsi" w:cstheme="minorHAnsi"/>
+          <w:b/>
+          <w:noProof/>
+        </w:rPr>
+        <w:t>TRABAJADOR_</w:t>
+      </w:r>
+      <w:r>
+        <w:rPr>
+          <w:rFonts w:asciiTheme="minorHAnsi" w:hAnsiTheme="minorHAnsi" w:cstheme="minorHAnsi"/>
+          <w:b/>
+          <w:noProof/>
+        </w:rPr>
+        <w:t>AP_MATERNO</w:t>
+      </w:r>
+      <w:r>
+        <w:rPr>
+          <w:rFonts w:asciiTheme="minorHAnsi" w:hAnsiTheme="minorHAnsi" w:cstheme="minorHAnsi"/>
+          <w:b/>
+          <w:noProof/>
+        </w:rPr>
+        <w:t>}}</w:t>
+      </w:r>
+      <w:r>
+        <w:rPr>
+          <w:rFonts w:asciiTheme="minorHAnsi" w:hAnsiTheme="minorHAnsi" w:cstheme="minorHAnsi"/>
+          <w:b/>
+        </w:rPr>
+        <w:t xml:space="preserve">, RUT: </w:t>
+      </w:r>
+      <w:r>
+        <w:rPr>
+          <w:rFonts w:asciiTheme="minorHAnsi" w:hAnsiTheme="minorHAnsi" w:cstheme="minorHAnsi"/>
+          <w:b/>
+          <w:noProof/>
+        </w:rPr>
+        <w:t>{{</w:t>
+      </w:r>
+      <w:r>
+        <w:rPr>
+          <w:rFonts w:asciiTheme="minorHAnsi" w:hAnsiTheme="minorHAnsi" w:cstheme="minorHAnsi"/>
+          <w:b/>
+          <w:noProof/>
+        </w:rPr>
+        <w:t>TRABAJADOR_</w:t>
+      </w:r>
+      <w:r>
+        <w:rPr>
+          <w:rFonts w:asciiTheme="minorHAnsi" w:hAnsiTheme="minorHAnsi" w:cstheme="minorHAnsi"/>
+          <w:b/>
+          <w:noProof/>
+        </w:rPr>
+        <w:t>RUT}}</w:t>
+      </w:r>
+      <w:r>
+        <w:rPr>
+          <w:rFonts w:asciiTheme="minorHAnsi" w:hAnsiTheme="minorHAnsi" w:cstheme="minorHAnsi"/>
+        </w:rPr>
+        <w:t xml:space="preserve">, en adelante </w:t>
+      </w:r>
+      <w:r>
+        <w:rPr>
+          <w:rFonts w:asciiTheme="minorHAnsi" w:hAnsiTheme="minorHAnsi" w:cstheme="minorHAnsi"/>
+          <w:b/>
+        </w:rPr>
+        <w:t>El Trabajador</w:t>
+      </w:r>
+      <w:r>
+        <w:rPr>
+          <w:rFonts w:asciiTheme="minorHAnsi" w:hAnsiTheme="minorHAnsi" w:cstheme="minorHAnsi"/>
+        </w:rPr>
+        <w:t xml:space="preserve">, </w:t>
+      </w:r>
+      <w:r>
+        <w:rPr>
+          <w:rFonts w:asciiTheme="minorHAnsi" w:hAnsiTheme="minorHAnsi" w:cstheme="minorHAnsi"/>
+        </w:rPr>
+        <w:t>se ha convenido el siguiente anexo de contrato de trabajo</w:t>
+      </w:r>
+      <w:r>
+        <w:rPr>
+          <w:rFonts w:asciiTheme="minorHAnsi" w:hAnsiTheme="minorHAnsi" w:cstheme="minorHAnsi"/>
+        </w:rPr>
+        <w:t>:</w:t>
+      </w:r>
     </w:p>
     <w:p>
       <w:pPr>
+        <w:spacing w:before="240" w:after="0"/>
         <w:jc w:val="both"/>
         <w:rPr>
           <w:rFonts w:asciiTheme="minorHAnsi" w:hAnsiTheme="minorHAnsi" w:cstheme="minorHAnsi"/>
-        </w:rPr>
-      </w:pPr>
-      <w:r>
-        <w:rPr>
-          <w:rFonts w:asciiTheme="minorHAnsi" w:hAnsiTheme="minorHAnsi" w:cstheme="minorHAnsi"/>
-        </w:rPr>
-        <w:t>Entre</w:t>
-      </w:r>
-      <w:r>
-        <w:rPr>
-          <w:rFonts w:asciiTheme="minorHAnsi" w:hAnsiTheme="minorHAnsi" w:cstheme="minorHAnsi"/>
-        </w:rPr>
-        <w:t xml:space="preserve"> </w:t>
-      </w:r>
-      <w:r>
-        <w:rPr>
-          <w:rFonts w:asciiTheme="minorHAnsi" w:hAnsiTheme="minorHAnsi" w:cstheme="minorHAnsi"/>
           <w:b/>
-          <w:noProof/>
-        </w:rPr>
-        <w:t>{{EMPLEADOR_RAZON_SOCIAL}}</w:t>
-      </w:r>
+          <w:bCs/>
+        </w:rPr>
+      </w:pPr>
       <w:r>
         <w:rPr>
           <w:rFonts w:asciiTheme="minorHAnsi" w:hAnsiTheme="minorHAnsi" w:cstheme="minorHAnsi"/>
           <w:b/>
-        </w:rPr>
-        <w:t>,</w:t>
-      </w:r>
-      <w:r>
-        <w:rPr>
-          <w:rFonts w:asciiTheme="minorHAnsi" w:hAnsiTheme="minorHAnsi" w:cstheme="minorHAnsi"/>
-        </w:rPr>
-        <w:t xml:space="preserve"> </w:t>
-      </w:r>
-      <w:r>
-        <w:rPr>
-          <w:rFonts w:asciiTheme="minorHAnsi" w:hAnsiTheme="minorHAnsi" w:cstheme="minorHAnsi"/>
-          <w:b/>
-        </w:rPr>
-        <w:t xml:space="preserve">RUT: </w:t>
-      </w:r>
-      <w:r>
-        <w:rPr>
-          <w:rFonts w:asciiTheme="minorHAnsi" w:hAnsiTheme="minorHAnsi" w:cstheme="minorHAnsi"/>
-          <w:b/>
-          <w:noProof/>
-        </w:rPr>
-        <w:t>{{</w:t>
-      </w:r>
-      <w:r>
-        <w:rPr>
-          <w:rFonts w:asciiTheme="minorHAnsi" w:hAnsiTheme="minorHAnsi" w:cstheme="minorHAnsi"/>
-          <w:b/>
-          <w:noProof/>
-        </w:rPr>
-        <w:t>EMPLEADOR_RUT</w:t>
-      </w:r>
-      <w:r>
-        <w:rPr>
-          <w:rFonts w:asciiTheme="minorHAnsi" w:hAnsiTheme="minorHAnsi" w:cstheme="minorHAnsi"/>
-          <w:b/>
-          <w:noProof/>
-        </w:rPr>
-        <w:t>}}</w:t>
-      </w:r>
-      <w:r>
-        <w:rPr>
-          <w:rFonts w:asciiTheme="minorHAnsi" w:hAnsiTheme="minorHAnsi" w:cstheme="minorHAnsi"/>
-          <w:b/>
-        </w:rPr>
-        <w:t>,</w:t>
-      </w:r>
-      <w:r>
-        <w:rPr>
-          <w:rFonts w:asciiTheme="minorHAnsi" w:hAnsiTheme="minorHAnsi" w:cstheme="minorHAnsi"/>
-        </w:rPr>
-        <w:t xml:space="preserve"> representada legalmente por don </w:t>
-      </w:r>
-      <w:r>
-        <w:rPr>
-          <w:rFonts w:asciiTheme="minorHAnsi" w:hAnsiTheme="minorHAnsi" w:cstheme="minorHAnsi"/>
-          <w:noProof/>
-        </w:rPr>
-        <w:t>{{</w:t>
-      </w:r>
-      <w:r>
-        <w:rPr>
-          <w:rFonts w:asciiTheme="minorHAnsi" w:hAnsiTheme="minorHAnsi" w:cstheme="minorHAnsi"/>
-          <w:noProof/>
-        </w:rPr>
-        <w:t>REP_LEGAL_NOMBRE</w:t>
-      </w:r>
-      <w:r>
-        <w:rPr>
-          <w:rFonts w:asciiTheme="minorHAnsi" w:hAnsiTheme="minorHAnsi" w:cstheme="minorHAnsi"/>
-          <w:noProof/>
-        </w:rPr>
-        <w:t>}}</w:t>
-      </w:r>
-      <w:r>
-        <w:rPr>
-          <w:rFonts w:asciiTheme="minorHAnsi" w:hAnsiTheme="minorHAnsi" w:cstheme="minorHAnsi"/>
-        </w:rPr>
-        <w:t xml:space="preserve">, RUT: </w:t>
-      </w:r>
-      <w:r>
-        <w:rPr>
-          <w:rFonts w:asciiTheme="minorHAnsi" w:hAnsiTheme="minorHAnsi" w:cstheme="minorHAnsi"/>
-          <w:noProof/>
-        </w:rPr>
-        <w:t>{{</w:t>
-      </w:r>
-      <w:r>
-        <w:rPr>
-          <w:rFonts w:asciiTheme="minorHAnsi" w:hAnsiTheme="minorHAnsi" w:cstheme="minorHAnsi"/>
-          <w:noProof/>
-        </w:rPr>
-        <w:t>REP_LEGAL_RUT</w:t>
-      </w:r>
-      <w:r>
-        <w:rPr>
-          <w:rFonts w:asciiTheme="minorHAnsi" w:hAnsiTheme="minorHAnsi" w:cstheme="minorHAnsi"/>
-          <w:noProof/>
-        </w:rPr>
-        <w:t>}}</w:t>
-      </w:r>
-      <w:r>
-        <w:rPr>
-          <w:rFonts w:asciiTheme="minorHAnsi" w:hAnsiTheme="minorHAnsi" w:cstheme="minorHAnsi"/>
-        </w:rPr>
-        <w:t xml:space="preserve">, ambos con domicilio en </w:t>
-      </w:r>
-      <w:r>
-        <w:rPr>
-          <w:rFonts w:asciiTheme="minorHAnsi" w:hAnsiTheme="minorHAnsi" w:cstheme="minorHAnsi"/>
-          <w:noProof/>
-        </w:rPr>
-        <w:t>{{</w:t>
-      </w:r>
-      <w:r>
-        <w:rPr>
-          <w:rFonts w:asciiTheme="minorHAnsi" w:hAnsiTheme="minorHAnsi" w:cstheme="minorHAnsi"/>
-          <w:noProof/>
-        </w:rPr>
-        <w:t>EMPLEADOR_DIRECCION</w:t>
-      </w:r>
-      <w:r>
-        <w:rPr>
-          <w:rFonts w:asciiTheme="minorHAnsi" w:hAnsiTheme="minorHAnsi" w:cstheme="minorHAnsi"/>
-          <w:noProof/>
-        </w:rPr>
-        <w:t>}}</w:t>
-      </w:r>
-      <w:r>
-        <w:rPr>
-          <w:rFonts w:asciiTheme="minorHAnsi" w:hAnsiTheme="minorHAnsi" w:cstheme="minorHAnsi"/>
-        </w:rPr>
-        <w:t xml:space="preserve">, comuna de </w:t>
-      </w:r>
-      <w:r>
-        <w:rPr>
-          <w:rFonts w:asciiTheme="minorHAnsi" w:hAnsiTheme="minorHAnsi" w:cstheme="minorHAnsi"/>
-          <w:noProof/>
-        </w:rPr>
-        <w:t>{{</w:t>
-      </w:r>
-      <w:r>
-        <w:t>E</w:t>
-      </w:r>
-      <w:r>
-        <w:rPr>
-          <w:rFonts w:asciiTheme="minorHAnsi" w:hAnsiTheme="minorHAnsi" w:cstheme="minorHAnsi"/>
-          <w:noProof/>
-        </w:rPr>
-        <w:t>MPLEADOR_COMUNA</w:t>
-      </w:r>
-      <w:r>
-        <w:rPr>
-          <w:rFonts w:asciiTheme="minorHAnsi" w:hAnsiTheme="minorHAnsi" w:cstheme="minorHAnsi"/>
-          <w:noProof/>
-        </w:rPr>
-        <w:t>}}</w:t>
-      </w:r>
-      <w:r>
-        <w:rPr>
-          <w:rFonts w:asciiTheme="minorHAnsi" w:hAnsiTheme="minorHAnsi" w:cstheme="minorHAnsi"/>
-        </w:rPr>
-        <w:t xml:space="preserve">, en lo sucesivo </w:t>
-      </w:r>
-      <w:r>
-        <w:rPr>
-          <w:rFonts w:asciiTheme="minorHAnsi" w:hAnsiTheme="minorHAnsi" w:cstheme="minorHAnsi"/>
-          <w:b/>
-        </w:rPr>
-        <w:t>El Empleador,</w:t>
-      </w:r>
-      <w:r>
-        <w:rPr>
-          <w:rFonts w:asciiTheme="minorHAnsi" w:hAnsiTheme="minorHAnsi" w:cstheme="minorHAnsi"/>
           <w:bCs/>
         </w:rPr>
-        <w:t xml:space="preserve"> por una parte; y por la otra,</w:t>
-      </w:r>
-      <w:r>
-        <w:rPr>
-          <w:rFonts w:asciiTheme="minorHAnsi" w:hAnsiTheme="minorHAnsi" w:cstheme="minorHAnsi"/>
-        </w:rPr>
-        <w:t xml:space="preserve"> </w:t>
-      </w:r>
-      <w:r>
-        <w:rPr>
-          <w:rFonts w:asciiTheme="minorHAnsi" w:hAnsiTheme="minorHAnsi" w:cstheme="minorHAnsi"/>
-          <w:noProof/>
-        </w:rPr>
-        <w:t>don</w:t>
-      </w:r>
-      <w:r>
-        <w:rPr>
-          <w:rFonts w:asciiTheme="minorHAnsi" w:hAnsiTheme="minorHAnsi" w:cstheme="minorHAnsi"/>
-          <w:noProof/>
-        </w:rPr>
-        <w:t>/ña</w:t>
-      </w:r>
-      <w:r>
-        <w:rPr>
-          <w:rFonts w:asciiTheme="minorHAnsi" w:hAnsiTheme="minorHAnsi" w:cstheme="minorHAnsi"/>
-        </w:rPr>
-        <w:t xml:space="preserve"> </w:t>
-      </w:r>
-      <w:r>
-        <w:rPr>
-          <w:rFonts w:asciiTheme="minorHAnsi" w:hAnsiTheme="minorHAnsi" w:cstheme="minorHAnsi"/>
-          <w:b/>
-          <w:noProof/>
-        </w:rPr>
-        <w:t>{{</w:t>
-      </w:r>
-      <w:r>
-        <w:rPr>
-          <w:rFonts w:asciiTheme="minorHAnsi" w:hAnsiTheme="minorHAnsi" w:cstheme="minorHAnsi"/>
-          <w:b/>
-          <w:noProof/>
-        </w:rPr>
-        <w:t>TRABAJADOR_</w:t>
-      </w:r>
-      <w:r>
-        <w:rPr>
-          <w:rFonts w:asciiTheme="minorHAnsi" w:hAnsiTheme="minorHAnsi" w:cstheme="minorHAnsi"/>
-          <w:b/>
-          <w:noProof/>
-        </w:rPr>
-        <w:t>NOMBRES</w:t>
-      </w:r>
-      <w:r>
-        <w:rPr>
-          <w:rFonts w:asciiTheme="minorHAnsi" w:hAnsiTheme="minorHAnsi" w:cstheme="minorHAnsi"/>
-          <w:b/>
-          <w:noProof/>
-        </w:rPr>
-        <w:t>}} {{</w:t>
-      </w:r>
-      <w:r>
-        <w:rPr>
-          <w:rFonts w:asciiTheme="minorHAnsi" w:hAnsiTheme="minorHAnsi" w:cstheme="minorHAnsi"/>
-          <w:b/>
-          <w:noProof/>
-        </w:rPr>
-        <w:t>TRABAJADOR_</w:t>
-      </w:r>
-      <w:r>
-        <w:rPr>
-          <w:rFonts w:asciiTheme="minorHAnsi" w:hAnsiTheme="minorHAnsi" w:cstheme="minorHAnsi"/>
-          <w:b/>
-          <w:noProof/>
-        </w:rPr>
-        <w:t>AP_PATERNO</w:t>
-      </w:r>
-      <w:r>
-        <w:rPr>
-          <w:rFonts w:asciiTheme="minorHAnsi" w:hAnsiTheme="minorHAnsi" w:cstheme="minorHAnsi"/>
-          <w:b/>
-          <w:noProof/>
-        </w:rPr>
-        <w:t>}} {{</w:t>
-      </w:r>
-      <w:r>
-        <w:rPr>
-          <w:rFonts w:asciiTheme="minorHAnsi" w:hAnsiTheme="minorHAnsi" w:cstheme="minorHAnsi"/>
-          <w:b/>
-          <w:noProof/>
-        </w:rPr>
-        <w:t>TRABAJADOR_</w:t>
-      </w:r>
-      <w:r>
-        <w:rPr>
-          <w:rFonts w:asciiTheme="minorHAnsi" w:hAnsiTheme="minorHAnsi" w:cstheme="minorHAnsi"/>
-          <w:b/>
-          <w:noProof/>
-        </w:rPr>
-        <w:t>AP_MATERNO</w:t>
-      </w:r>
-      <w:r>
-        <w:rPr>
-          <w:rFonts w:asciiTheme="minorHAnsi" w:hAnsiTheme="minorHAnsi" w:cstheme="minorHAnsi"/>
-          <w:b/>
-          <w:noProof/>
-        </w:rPr>
-        <w:t>}}</w:t>
-      </w:r>
-      <w:r>
-        <w:rPr>
-          <w:rFonts w:asciiTheme="minorHAnsi" w:hAnsiTheme="minorHAnsi" w:cstheme="minorHAnsi"/>
-          <w:b/>
-        </w:rPr>
-        <w:t xml:space="preserve">, RUT: </w:t>
-      </w:r>
-      <w:r>
-        <w:rPr>
-          <w:rFonts w:asciiTheme="minorHAnsi" w:hAnsiTheme="minorHAnsi" w:cstheme="minorHAnsi"/>
-          <w:b/>
-          <w:noProof/>
-        </w:rPr>
-        <w:t>{{</w:t>
-      </w:r>
-      <w:r>
-        <w:rPr>
-          <w:rFonts w:asciiTheme="minorHAnsi" w:hAnsiTheme="minorHAnsi" w:cstheme="minorHAnsi"/>
-          <w:b/>
-          <w:noProof/>
-        </w:rPr>
-        <w:t>TRABAJADOR_</w:t>
-      </w:r>
-      <w:r>
-        <w:rPr>
-          <w:rFonts w:asciiTheme="minorHAnsi" w:hAnsiTheme="minorHAnsi" w:cstheme="minorHAnsi"/>
-          <w:b/>
-          <w:noProof/>
-        </w:rPr>
-        <w:t>RUT}}</w:t>
-      </w:r>
-      <w:r>
-        <w:rPr>
-          <w:rFonts w:asciiTheme="minorHAnsi" w:hAnsiTheme="minorHAnsi" w:cstheme="minorHAnsi"/>
-        </w:rPr>
-        <w:t xml:space="preserve">, en adelante </w:t>
-      </w:r>
-      <w:r>
-        <w:rPr>
-          <w:rFonts w:asciiTheme="minorHAnsi" w:hAnsiTheme="minorHAnsi" w:cstheme="minorHAnsi"/>
-          <w:b/>
-        </w:rPr>
-        <w:t>El Trabajador</w:t>
-      </w:r>
-      <w:r>
-        <w:rPr>
-          <w:rFonts w:asciiTheme="minorHAnsi" w:hAnsiTheme="minorHAnsi" w:cstheme="minorHAnsi"/>
-        </w:rPr>
-        <w:t xml:space="preserve">, </w:t>
-      </w:r>
-      <w:r>
-        <w:rPr>
-          <w:rFonts w:asciiTheme="minorHAnsi" w:hAnsiTheme="minorHAnsi" w:cstheme="minorHAnsi"/>
-        </w:rPr>
-        <w:t>se ha convenido el siguiente anexo de contrato de trabajo</w:t>
-      </w:r>
-      <w:r>
-        <w:rPr>
-          <w:rFonts w:asciiTheme="minorHAnsi" w:hAnsiTheme="minorHAnsi" w:cstheme="minorHAnsi"/>
-        </w:rPr>
-        <w:t>:</w:t>
+        <w:t>PRIMERO:</w:t>
       </w:r>
     </w:p>
     <w:p>
       <w:pPr>
+        <w:spacing w:after="0"/>
+        <w:jc w:val="both"/>
+        <w:rPr>
+          <w:rFonts w:asciiTheme="minorHAnsi" w:hAnsiTheme="minorHAnsi" w:cstheme="minorHAnsi"/>
+        </w:rPr>
+      </w:pPr>
+      <w:r>
+        <w:rPr>
+          <w:rFonts w:asciiTheme="minorHAnsi" w:hAnsiTheme="minorHAnsi" w:cstheme="minorHAnsi"/>
+        </w:rPr>
+        <w:t>Las partes acuerdan prorrogar el contrato de trabajo a plazo fijo vigente, el cual tenía como fecha de término el día {{CONTRATO_FECHA_TERMINO_ANTERIOR}}, extendiéndose su duración hasta el día {{CONTRATO_FECHA_TERMINO_NUEVA}}, fecha en la cual el contrato finalizará de pleno derecho, salvo acuerdo expreso de las partes en contrario.</w:t>
+      </w:r>
+    </w:p>
+    <w:p>
+      <w:pPr>
         <w:spacing w:before="240" w:after="0"/>
         <w:jc w:val="both"/>
         <w:rPr>
@@ -420,7 +446,7 @@
           <w:b/>
           <w:bCs/>
         </w:rPr>
-        <w:t>PRIMERO:</w:t>
+        <w:t>SEGUNDO:</w:t>
       </w:r>
     </w:p>
     <w:p>
@@ -435,41 +461,35 @@
         <w:rPr>
           <w:rFonts w:asciiTheme="minorHAnsi" w:hAnsiTheme="minorHAnsi" w:cstheme="minorHAnsi"/>
         </w:rPr>
-        <w:t>Las partes acuerdan prorrogar el contrato de trabajo a plazo fijo vigente, el cual tenía como fecha de término el día {{CONTRATO_FECHA_TERMINO_ANTERIOR}}, extendiéndose su duración hasta el día {{CONTRATO_FECHA_TERMINO_NUEVA}}, fecha en la cual el contrato finalizará de pleno derecho, salvo acuerdo expreso de las partes en contrario.</w:t>
-      </w:r>
-    </w:p>
-    <w:p>
-      <w:pPr>
-        <w:spacing w:before="240" w:after="0"/>
-        <w:jc w:val="both"/>
+        <w:t xml:space="preserve">Se deja expresa constancia que el Trabajador ingresó al servicio del Empleador con fecha </w:t>
+      </w:r>
+      <w:r>
         <w:rPr>
           <w:rFonts w:asciiTheme="minorHAnsi" w:hAnsiTheme="minorHAnsi" w:cstheme="minorHAnsi"/>
           <w:b/>
           <w:bCs/>
         </w:rPr>
-      </w:pPr>
+        <w:t>{{CONTRATO_FECHA_INICIO}}</w:t>
+      </w:r>
+      <w:r>
+        <w:rPr>
+          <w:rFonts w:asciiTheme="minorHAnsi" w:hAnsiTheme="minorHAnsi" w:cstheme="minorHAnsi"/>
+        </w:rPr>
+        <w:t xml:space="preserve">, manteniéndose vigente el cargo de </w:t>
+      </w:r>
       <w:r>
         <w:rPr>
           <w:rFonts w:asciiTheme="minorHAnsi" w:hAnsiTheme="minorHAnsi" w:cstheme="minorHAnsi"/>
           <w:b/>
           <w:bCs/>
         </w:rPr>
-        <w:t>SEGUNDO:</w:t>
-      </w:r>
-    </w:p>
-    <w:p>
-      <w:pPr>
-        <w:spacing w:after="0"/>
-        <w:jc w:val="both"/>
-        <w:rPr>
-          <w:rFonts w:asciiTheme="minorHAnsi" w:hAnsiTheme="minorHAnsi" w:cstheme="minorHAnsi"/>
-        </w:rPr>
-      </w:pPr>
-      <w:r>
-        <w:rPr>
-          <w:rFonts w:asciiTheme="minorHAnsi" w:hAnsiTheme="minorHAnsi" w:cstheme="minorHAnsi"/>
-        </w:rPr>
-        <w:t>Se deja expresa constancia que el Trabajador ingresó al servicio del Empleador con fecha {{CONTRATO_FECHA_INICIO}}, manteniéndose vigente el cargo de {{CARGO_NOMBRE}}, así como todas y cada una de las demás cláusulas y condiciones estipuladas en el contrato de trabajo original y sus anexos posteriores, las que no se ven modificadas por el presente instrumento.</w:t>
+        <w:t>{{CARGO_NOMBRE}}</w:t>
+      </w:r>
+      <w:r>
+        <w:rPr>
+          <w:rFonts w:asciiTheme="minorHAnsi" w:hAnsiTheme="minorHAnsi" w:cstheme="minorHAnsi"/>
+        </w:rPr>
+        <w:t>, así como todas y cada una de las demás cláusulas y condiciones estipuladas en el contrato de trabajo original y sus anexos posteriores, las que no se ven modificadas por el presente instrumento.</w:t>
       </w:r>
     </w:p>
     <w:p>
@@ -762,28 +782,6 @@
     </w:tbl>
     <w:p>
       <w:pPr>
-        <w:jc w:val="both"/>
-        <w:rPr>
-          <w:rFonts w:asciiTheme="minorHAnsi" w:hAnsiTheme="minorHAnsi" w:cstheme="minorHAnsi"/>
-        </w:rPr>
-      </w:pPr>
-    </w:p>
-    <w:p>
-      <w:pPr>
-        <w:rPr>
-          <w:rFonts w:asciiTheme="minorHAnsi" w:hAnsiTheme="minorHAnsi" w:cstheme="minorHAnsi"/>
-        </w:rPr>
-      </w:pPr>
-    </w:p>
-    <w:p>
-      <w:pPr>
-        <w:rPr>
-          <w:rFonts w:asciiTheme="minorHAnsi" w:hAnsiTheme="minorHAnsi" w:cstheme="minorHAnsi"/>
-        </w:rPr>
-      </w:pPr>
-    </w:p>
-    <w:p>
-      <w:pPr>
         <w:tabs>
           <w:tab w:val="left" w:pos="6945"/>
         </w:tabs>
@@ -791,12 +789,6 @@
           <w:rFonts w:asciiTheme="minorHAnsi" w:hAnsiTheme="minorHAnsi" w:cstheme="minorHAnsi"/>
         </w:rPr>
       </w:pPr>
-      <w:r>
-        <w:rPr>
-          <w:rFonts w:asciiTheme="minorHAnsi" w:hAnsiTheme="minorHAnsi" w:cstheme="minorHAnsi"/>
-        </w:rPr>
-        <w:tab/>
-      </w:r>
     </w:p>
     <w:sectPr>
       <w:headerReference w:type="default" r:id="rId8"/>
@@ -5924,7 +5916,7 @@
       <w:szCs w:val="24"/>
     </w:rPr>
   </w:style>
-  <w:style w:type="character" w:styleId="Textoennegrita">
+  <w:style w:type="character" w:styleId="Fuerte">
     <w:name w:val="Strong"/>
     <w:basedOn w:val="Fuentedeprrafopredeter"/>
     <w:uiPriority w:val="22"/>

</xml_diff>